<commit_message>
perf: cut landing page blocking time; run end-to-end tests in parallel in CI
CI measured the landing page at 214 ms of blocking time (budget 200 ms).
Traces showed two causes, now fixed:
- The body font arriving after the first paint re-laid out every line.
  Noto Sans now uses font-display optional; titles keep swap.
- The Radix radio group behind the theme switch took over 100 ms to start
  on a slow phone. The switch is now three native radio buttons (arrow keys
  and screen readers work without script); about 10 KB less JavaScript.

CI: end-to-end tests run on three machines at once (one per screen size),
with the budgets on the phone job, next to the database and integration
job. Long journeys get more time under load; e2e clicks theme labels as a
person does.

Co-Authored-By: Claude Opus 5.5 <noreply@anthropic.com>
</commit_message>
<xml_diff>
--- a/docs/MedLearn_OS_Visual_UX_UI_Engineering_Plan_v0_6.docx
+++ b/docs/MedLearn_OS_Visual_UX_UI_Engineering_Plan_v0_6.docx
@@ -19396,7 +19396,7 @@
               <w:spacing w:after="40"/>
             </w:pPr>
             <w:r>
-              <w:t xml:space="preserve">Total blocking time</w:t>
+              <w:t xml:space="preserve">Total blocking time (CI)</w:t>
             </w:r>
           </w:p>
         </w:tc>
@@ -19418,7 +19418,7 @@
               <w:spacing w:after="40"/>
             </w:pPr>
             <w:r>
-              <w:t xml:space="preserve">100 to 440 ms</w:t>
+              <w:t xml:space="preserve">Landing page 214 ms</w:t>
             </w:r>
           </w:p>
         </w:tc>
@@ -19440,7 +19440,7 @@
               <w:spacing w:after="40"/>
             </w:pPr>
             <w:r>
-              <w:t xml:space="preserve">Lesson and Today under 200 ms; landing page close to the line on a busy laptop</w:t>
+              <w:t xml:space="preserve">See the pull request checks; Today 95 ms and lessons 103 ms</w:t>
             </w:r>
           </w:p>
         </w:tc>
@@ -19478,6 +19478,30 @@
       </w:r>
       <w:r>
         <w:t xml:space="preserve">the schema library (91 KB compressed) left the first download: content is checked by a unit test instead of in the browser, and the two places that check server replies load it on demand. Workspace packages now declare that they have no side effects, so unused components drop out. The landing page curve renders on the server with nothing to hydrate.</w:t>
+      </w:r>
+    </w:p>
+    <w:p>
+      <w:r>
+        <w:rPr>
+          <w:b/>
+          <w:color w:val="17324D"/>
+        </w:rPr>
+        <w:t xml:space="preserve">Landing page blocking time: </w:t>
+      </w:r>
+      <w:r>
+        <w:t xml:space="preserve">CI first measured 214 ms. Traces found two causes: the body font arriving after the first paint re-laid out every line, and the scripted theme switch (a Radix radio group) took over 100 ms to start on a slow phone. The body font now uses font-display optional (titles keep swap, so the display serif always shows), and the theme switch is three native radio buttons, which need no script to work.</w:t>
+      </w:r>
+    </w:p>
+    <w:p>
+      <w:r>
+        <w:rPr>
+          <w:b/>
+          <w:color w:val="17324D"/>
+        </w:rPr>
+        <w:t xml:space="preserve">Faster CI: </w:t>
+      </w:r>
+      <w:r>
+        <w:t xml:space="preserve">the end-to-end tests run on three machines at once, one per screen size, with the budgets on the phone job; database and integration tests run on a fourth. The wait drops from about 11 minutes to about 8, at the cost of more CI minutes (GitHub Free gives private repositories 2,000 a month).</w:t>
       </w:r>
     </w:p>
     <w:p>

</xml_diff>